<commit_message>
Gunun Gorevleri: 2. set eklendi, ayni/benzer ayiklandi (F29/R36/Z40)
Ikinci 30 gunluk set mevcut havuzla birlestirildi; cogu zaten var olan/benzer oldugundan ayiklandi, yalnizca gercekten yeni gorevler ardisik tekrar olmayacak sekilde araya yerlestirildi. Yeni: ciplak ayakla yuru, islenmis gida, gokyuzu izle, korkuyu sevgiyle birak, icindeki guc/ic huzur, cocukluk hayalleri, ilham cumlesi kaydet vb. Hepsi benzersiz, ardisik tekrar yok. v110.

Co-Authored-By: Claude Opus 4.8 <noreply@anthropic.com>
</commit_message>
<xml_diff>
--- a/Günün Görevleri/Günün Görevleri.docx
+++ b/Günün Görevleri/Günün Görevleri.docx
@@ -69,6 +69,11 @@
     </w:p>
     <w:p>
       <w:r>
+        <w:t xml:space="preserve">🌿 Fiziksel: 5 dakika çıplak ayakla yürü.</w:t>
+      </w:r>
+    </w:p>
+    <w:p>
+      <w:r>
         <w:t xml:space="preserve">🌿 Fiziksel: Gün içinde dik duruşuna dikkat et.</w:t>
       </w:r>
     </w:p>
@@ -99,6 +104,11 @@
     </w:p>
     <w:p>
       <w:r>
+        <w:t xml:space="preserve">🌿 Fiziksel: İşlenmiş gıda tüketme.</w:t>
+      </w:r>
+    </w:p>
+    <w:p>
+      <w:r>
         <w:t xml:space="preserve">🌿 Fiziksel: 1 saat telefonu elinden bırak.</w:t>
       </w:r>
     </w:p>
@@ -169,6 +179,11 @@
     </w:p>
     <w:p>
       <w:r>
+        <w:t xml:space="preserve">🧠 Zihinsel: Çocukluk hayallerini hatırla.</w:t>
+      </w:r>
+    </w:p>
+    <w:p>
+      <w:r>
         <w:t xml:space="preserve">🧠 Zihinsel: Yeni bir bilgi araştır.</w:t>
       </w:r>
     </w:p>
@@ -189,6 +204,11 @@
     </w:p>
     <w:p>
       <w:r>
+        <w:t xml:space="preserve">🧠 Zihinsel: Gelecekteki hayalindeki günü yaz.</w:t>
+      </w:r>
+    </w:p>
+    <w:p>
+      <w:r>
         <w:t xml:space="preserve">🧠 Zihinsel: Kötü bir alışkanlığını fark et.</w:t>
       </w:r>
     </w:p>
@@ -209,6 +229,16 @@
     </w:p>
     <w:p>
       <w:r>
+        <w:t xml:space="preserve">🧠 Zihinsel: Bir başarı hikayesi oku.</w:t>
+      </w:r>
+    </w:p>
+    <w:p>
+      <w:r>
+        <w:t xml:space="preserve">🧠 Zihinsel: Bir ilham cümlesi kaydet.</w:t>
+      </w:r>
+    </w:p>
+    <w:p>
+      <w:r>
         <w:t xml:space="preserve">🧠 Zihinsel: Eski bir anını yeniden değerlendir.</w:t>
       </w:r>
     </w:p>
@@ -219,6 +249,11 @@
     </w:p>
     <w:p>
       <w:r>
+        <w:t xml:space="preserve">🧠 Zihinsel: Bir konuda farklı görüş araştır.</w:t>
+      </w:r>
+    </w:p>
+    <w:p>
+      <w:r>
         <w:t xml:space="preserve">🧠 Zihinsel: Hayal panona yeni bir hedef ekle.</w:t>
       </w:r>
     </w:p>
@@ -229,6 +264,11 @@
     </w:p>
     <w:p>
       <w:r>
+        <w:t xml:space="preserve">🧠 Zihinsel: Bir hayalini detaylandır.</w:t>
+      </w:r>
+    </w:p>
+    <w:p>
+      <w:r>
         <w:t xml:space="preserve">🧠 Zihinsel: Bugünün dersini yaz.</w:t>
       </w:r>
     </w:p>
@@ -239,6 +279,11 @@
     </w:p>
     <w:p>
       <w:r>
+        <w:t xml:space="preserve">🧠 Zihinsel: Bugün seni zorlayan şeyi yaz.</w:t>
+      </w:r>
+    </w:p>
+    <w:p>
+      <w:r>
         <w:t xml:space="preserve">🧠 Zihinsel: Bir hedefini gözden geçir.</w:t>
       </w:r>
     </w:p>
@@ -254,11 +299,21 @@
     </w:p>
     <w:p>
       <w:r>
+        <w:t xml:space="preserve">🧠 Zihinsel: İlham aldığın bir kişiyi araştır.</w:t>
+      </w:r>
+    </w:p>
+    <w:p>
+      <w:r>
         <w:t xml:space="preserve">🧠 Zihinsel: Yeni bir beceri araştır.</w:t>
       </w:r>
     </w:p>
     <w:p>
       <w:r>
+        <w:t xml:space="preserve">🧠 Zihinsel: Bugünkü duygularını yaz.</w:t>
+      </w:r>
+    </w:p>
+    <w:p>
+      <w:r>
         <w:t xml:space="preserve">🧠 Zihinsel: Yeni bir podcast dinle.</w:t>
       </w:r>
     </w:p>
@@ -269,6 +324,11 @@
     </w:p>
     <w:p>
       <w:r>
+        <w:t xml:space="preserve">🧠 Zihinsel: Kendin için yeni bir karar al.</w:t>
+      </w:r>
+    </w:p>
+    <w:p>
+      <w:r>
         <w:t xml:space="preserve">🧠 Zihinsel: Kendine yeni bir söz ver.</w:t>
       </w:r>
     </w:p>
@@ -364,11 +424,21 @@
     </w:p>
     <w:p>
       <w:r>
+        <w:t xml:space="preserve">🌙 Ruhsal: Kalbine teşekkür et.</w:t>
+      </w:r>
+    </w:p>
+    <w:p>
+      <w:r>
         <w:t xml:space="preserve">🌙 Ruhsal: Gözlerini kapatıp iç sesini dinle.</w:t>
       </w:r>
     </w:p>
     <w:p>
       <w:r>
+        <w:t xml:space="preserve">🌙 Ruhsal: Gökyüzünü 5 dakika izle.</w:t>
+      </w:r>
+    </w:p>
+    <w:p>
+      <w:r>
         <w:t xml:space="preserve">🌙 Ruhsal: Sessiz bir farkındalık anı oluştur.</w:t>
       </w:r>
     </w:p>
@@ -389,6 +459,11 @@
     </w:p>
     <w:p>
       <w:r>
+        <w:t xml:space="preserve">🌙 Ruhsal: O korkuyu sevgiyle serbest bırak.</w:t>
+      </w:r>
+    </w:p>
+    <w:p>
+      <w:r>
         <w:t xml:space="preserve">🌙 Ruhsal: İçindeki çocuğa bir mektup yaz.</w:t>
       </w:r>
     </w:p>
@@ -399,6 +474,11 @@
     </w:p>
     <w:p>
       <w:r>
+        <w:t xml:space="preserve">🌙 Ruhsal: İçindeki gücü hissetmeye çalış.</w:t>
+      </w:r>
+    </w:p>
+    <w:p>
+      <w:r>
         <w:t xml:space="preserve">🌙 Ruhsal: Bir dileğini evrene bırak.</w:t>
       </w:r>
     </w:p>
@@ -409,12 +489,22 @@
     </w:p>
     <w:p>
       <w:r>
+        <w:t xml:space="preserve">🌙 Ruhsal: İç huzurunu hissetmeye çalış.</w:t>
+      </w:r>
+    </w:p>
+    <w:p>
+      <w:r>
         <w:t xml:space="preserve">🌙 Ruhsal: Minnet duyduğun 10 şeyi yaz.</w:t>
       </w:r>
     </w:p>
     <w:p>
       <w:r>
         <w:t xml:space="preserve">🌙 Ruhsal: Birine içten teşekkür et.</w:t>
+      </w:r>
+    </w:p>
+    <w:p>
+      <w:r>
+        <w:t xml:space="preserve">🌙 Ruhsal: Hayatına gelen güzellikleri düşün.</w:t>
       </w:r>
     </w:p>
     <w:p>

</xml_diff>

<commit_message>
Gunun Gorevleri: 3. set eklendi, ayni/benzer ayiklandi (F33/R42/Z45)
Ucuncu set mevcut havuzla birlestirildi; benzerleri ayiklandi. Yeni: fazla oturmama, calisma alanini sadelestir, erken yat, cevreyi gozlemleyerek yuru; kendine sormadigin soru, bugunku basari, kendini kesfet, hedefi somutlastir, gurur duydugun 10 sey; bugunku ruh halini yaz, cesaret alanini dusun, icsel rehbere sor, kalbinden sevgi gonder, ruhunu besleyen sey, yeni ay niyeti. Hepsi benzersiz, ardisik tekrar yok. v111.

Co-Authored-By: Claude Opus 4.8 <noreply@anthropic.com>
</commit_message>
<xml_diff>
--- a/Günün Görevleri/Günün Görevleri.docx
+++ b/Günün Görevleri/Günün Görevleri.docx
@@ -89,6 +89,11 @@
     </w:p>
     <w:p>
       <w:r>
+        <w:t xml:space="preserve">🌿 Fiziksel: Çalışma alanından 10 gereksiz şeyi kaldır.</w:t>
+      </w:r>
+    </w:p>
+    <w:p>
+      <w:r>
         <w:t xml:space="preserve">🌿 Fiziksel: Sebze ağırlıklı beslen.</w:t>
       </w:r>
     </w:p>
@@ -109,6 +114,11 @@
     </w:p>
     <w:p>
       <w:r>
+        <w:t xml:space="preserve">🌿 Fiziksel: 1 saat fazla oturmamaya dikkat et.</w:t>
+      </w:r>
+    </w:p>
+    <w:p>
+      <w:r>
         <w:t xml:space="preserve">🌿 Fiziksel: 1 saat telefonu elinden bırak.</w:t>
       </w:r>
     </w:p>
@@ -134,11 +144,21 @@
     </w:p>
     <w:p>
       <w:r>
+        <w:t xml:space="preserve">🌿 Fiziksel: Daha erken yatmaya çalış.</w:t>
+      </w:r>
+    </w:p>
+    <w:p>
+      <w:r>
         <w:t xml:space="preserve">🌿 Fiziksel: Gün içinde daha çok hareket et.</w:t>
       </w:r>
     </w:p>
     <w:p>
       <w:r>
+        <w:t xml:space="preserve">🌿 Fiziksel: Yürüyüş yaparken çevreni gözlemle.</w:t>
+      </w:r>
+    </w:p>
+    <w:p>
+      <w:r>
         <w:t xml:space="preserve">🌿 Fiziksel: Yatmadan önce hafif esneme yap.</w:t>
       </w:r>
     </w:p>
@@ -169,6 +189,11 @@
     </w:p>
     <w:p>
       <w:r>
+        <w:t xml:space="preserve">🧠 Zihinsel: Kendine sormadığın bir soruyu sor.</w:t>
+      </w:r>
+    </w:p>
+    <w:p>
+      <w:r>
         <w:t xml:space="preserve">🧠 Zihinsel: Bir TED konuşması izle.</w:t>
       </w:r>
     </w:p>
@@ -279,6 +304,11 @@
     </w:p>
     <w:p>
       <w:r>
+        <w:t xml:space="preserve">🧠 Zihinsel: Bugünkü başarını yaz.</w:t>
+      </w:r>
+    </w:p>
+    <w:p>
+      <w:r>
         <w:t xml:space="preserve">🧠 Zihinsel: Bugün seni zorlayan şeyi yaz.</w:t>
       </w:r>
     </w:p>
@@ -304,6 +334,11 @@
     </w:p>
     <w:p>
       <w:r>
+        <w:t xml:space="preserve">🧠 Zihinsel: Bir hedefini somutlaştır.</w:t>
+      </w:r>
+    </w:p>
+    <w:p>
+      <w:r>
         <w:t xml:space="preserve">🧠 Zihinsel: Yeni bir beceri araştır.</w:t>
       </w:r>
     </w:p>
@@ -314,6 +349,11 @@
     </w:p>
     <w:p>
       <w:r>
+        <w:t xml:space="preserve">🧠 Zihinsel: Kendinle ilgili yeni bir şey keşfet.</w:t>
+      </w:r>
+    </w:p>
+    <w:p>
+      <w:r>
         <w:t xml:space="preserve">🧠 Zihinsel: Yeni bir podcast dinle.</w:t>
       </w:r>
     </w:p>
@@ -334,6 +374,11 @@
     </w:p>
     <w:p>
       <w:r>
+        <w:t xml:space="preserve">🧠 Zihinsel: Kendinle gurur duyduğun 10 şeyi yaz.</w:t>
+      </w:r>
+    </w:p>
+    <w:p>
+      <w:r>
         <w:t xml:space="preserve">🧠 Zihinsel: Gelecek ay için hedeflerini belirle.</w:t>
       </w:r>
     </w:p>
@@ -429,6 +474,11 @@
     </w:p>
     <w:p>
       <w:r>
+        <w:t xml:space="preserve">🌙 Ruhsal: Bugünkü ruh halini tek kelimeyle yaz.</w:t>
+      </w:r>
+    </w:p>
+    <w:p>
+      <w:r>
         <w:t xml:space="preserve">🌙 Ruhsal: Gözlerini kapatıp iç sesini dinle.</w:t>
       </w:r>
     </w:p>
@@ -464,6 +514,11 @@
     </w:p>
     <w:p>
       <w:r>
+        <w:t xml:space="preserve">🌙 Ruhsal: Cesaret istediğin alanı düşün.</w:t>
+      </w:r>
+    </w:p>
+    <w:p>
+      <w:r>
         <w:t xml:space="preserve">🌙 Ruhsal: İçindeki çocuğa bir mektup yaz.</w:t>
       </w:r>
     </w:p>
@@ -474,6 +529,11 @@
     </w:p>
     <w:p>
       <w:r>
+        <w:t xml:space="preserve">🌙 Ruhsal: İçsel rehberine soru sor.</w:t>
+      </w:r>
+    </w:p>
+    <w:p>
+      <w:r>
         <w:t xml:space="preserve">🌙 Ruhsal: İçindeki gücü hissetmeye çalış.</w:t>
       </w:r>
     </w:p>
@@ -494,6 +554,11 @@
     </w:p>
     <w:p>
       <w:r>
+        <w:t xml:space="preserve">🌙 Ruhsal: Kalbinden sevgi gönder.</w:t>
+      </w:r>
+    </w:p>
+    <w:p>
+      <w:r>
         <w:t xml:space="preserve">🌙 Ruhsal: Minnet duyduğun 10 şeyi yaz.</w:t>
       </w:r>
     </w:p>
@@ -504,6 +569,11 @@
     </w:p>
     <w:p>
       <w:r>
+        <w:t xml:space="preserve">🌙 Ruhsal: Ruhunu besleyen şeyi yaz.</w:t>
+      </w:r>
+    </w:p>
+    <w:p>
+      <w:r>
         <w:t xml:space="preserve">🌙 Ruhsal: Hayatına gelen güzellikleri düşün.</w:t>
       </w:r>
     </w:p>
@@ -520,6 +590,11 @@
     <w:p>
       <w:r>
         <w:t xml:space="preserve">🌙 Ruhsal: Doğaya çıplak ayakla temas et.</w:t>
+      </w:r>
+    </w:p>
+    <w:p>
+      <w:r>
+        <w:t xml:space="preserve">🌙 Ruhsal: Yeni ay için bir niyet belirle.</w:t>
       </w:r>
     </w:p>
     <w:p>

</xml_diff>

<commit_message>
Gunun Gorevleri: 4. set eklendi, ayni/benzer ayiklandi (F46/R50/Z58)
Dorduncu set mevcut havuza eklendi (mevcut js okunup yeni ogeler eklenerek). Yeni ozgun gorevler: diger elle dis fircala, farkli yoldan don, yuzunu soguk suyla yika, gokyuzunu fotografla, kahve/cay hazirla, bitki sula vb.; vazgectigin hayal, 10 yil sonrasi, kendini uc kelimeyle tanimla, korkunun ogrettigi; aynada gozlerine bak, kendine saril, yukunu kagida yaz, kalbinle konus, kendini affet vb. Hepsi benzersiz, ardisik tekrar yok. v112.

Co-Authored-By: Claude Opus 4.8 <noreply@anthropic.com>
</commit_message>
<xml_diff>
--- a/Günün Görevleri/Günün Görevleri.docx
+++ b/Günün Görevleri/Günün Görevleri.docx
@@ -169,6 +169,71 @@
     </w:p>
     <w:p>
       <w:r>
+        <w:t xml:space="preserve">🌿 Fiziksel: Dişlerini diğer elinle fırçala.</w:t>
+      </w:r>
+    </w:p>
+    <w:p>
+      <w:r>
+        <w:t xml:space="preserve">🌿 Fiziksel: Farklı bir yoldan eve dön.</w:t>
+      </w:r>
+    </w:p>
+    <w:p>
+      <w:r>
+        <w:t xml:space="preserve">🌿 Fiziksel: Kendine güzel bir kahve veya çay hazırla.</w:t>
+      </w:r>
+    </w:p>
+    <w:p>
+      <w:r>
+        <w:t xml:space="preserve">🌿 Fiziksel: Yeni bir meyve veya yiyecek dene.</w:t>
+      </w:r>
+    </w:p>
+    <w:p>
+      <w:r>
+        <w:t xml:space="preserve">🌿 Fiziksel: Bir çiçeği veya bitkiyi incele.</w:t>
+      </w:r>
+    </w:p>
+    <w:p>
+      <w:r>
+        <w:t xml:space="preserve">🌿 Fiziksel: Güneş ışığında birkaç dakika kal.</w:t>
+      </w:r>
+    </w:p>
+    <w:p>
+      <w:r>
+        <w:t xml:space="preserve">🌿 Fiziksel: Camı açıp derin nefes al.</w:t>
+      </w:r>
+    </w:p>
+    <w:p>
+      <w:r>
+        <w:t xml:space="preserve">🌿 Fiziksel: Bir bitkiyi sula.</w:t>
+      </w:r>
+    </w:p>
+    <w:p>
+      <w:r>
+        <w:t xml:space="preserve">🌿 Fiziksel: Yeni bir yerde otur.</w:t>
+      </w:r>
+    </w:p>
+    <w:p>
+      <w:r>
+        <w:t xml:space="preserve">🌿 Fiziksel: Yüzünü soğuk suyla yıka.</w:t>
+      </w:r>
+    </w:p>
+    <w:p>
+      <w:r>
+        <w:t xml:space="preserve">🌿 Fiziksel: Bir şeyleri yavaş yap.</w:t>
+      </w:r>
+    </w:p>
+    <w:p>
+      <w:r>
+        <w:t xml:space="preserve">🌿 Fiziksel: Gökyüzünü fotoğrafla.</w:t>
+      </w:r>
+    </w:p>
+    <w:p>
+      <w:r>
+        <w:t xml:space="preserve">🌿 Fiziksel: Kendini küçük bir ödülle mutlu et.</w:t>
+      </w:r>
+    </w:p>
+    <w:p>
+      <w:r>
         <w:t xml:space="preserve">🧠 Zihinsel: Yeni bir kelime öğren.</w:t>
       </w:r>
     </w:p>
@@ -394,6 +459,71 @@
     </w:p>
     <w:p>
       <w:r>
+        <w:t xml:space="preserve">🧠 Zihinsel: Bugün seni en çok ne düşündürdü yaz.</w:t>
+      </w:r>
+    </w:p>
+    <w:p>
+      <w:r>
+        <w:t xml:space="preserve">🧠 Zihinsel: Bir korkunun sana ne öğrettiğini yaz.</w:t>
+      </w:r>
+    </w:p>
+    <w:p>
+      <w:r>
+        <w:t xml:space="preserve">🧠 Zihinsel: Gelecekteki kendine bir tavsiye ver.</w:t>
+      </w:r>
+    </w:p>
+    <w:p>
+      <w:r>
+        <w:t xml:space="preserve">🧠 Zihinsel: Vazgeçtiğin bir hayalini yaz.</w:t>
+      </w:r>
+    </w:p>
+    <w:p>
+      <w:r>
+        <w:t xml:space="preserve">🧠 Zihinsel: Hayatında değiştirmek istediğin tek şeyi yaz.</w:t>
+      </w:r>
+    </w:p>
+    <w:p>
+      <w:r>
+        <w:t xml:space="preserve">🧠 Zihinsel: Kendini üç kelimeyle tanımla.</w:t>
+      </w:r>
+    </w:p>
+    <w:p>
+      <w:r>
+        <w:t xml:space="preserve">🧠 Zihinsel: Bir yanlışını ve dersini yaz.</w:t>
+      </w:r>
+    </w:p>
+    <w:p>
+      <w:r>
+        <w:t xml:space="preserve">🧠 Zihinsel: Bir başarı hikayeni yaz.</w:t>
+      </w:r>
+    </w:p>
+    <w:p>
+      <w:r>
+        <w:t xml:space="preserve">🧠 Zihinsel: 10 yıl sonraki hayatını hayal et.</w:t>
+      </w:r>
+    </w:p>
+    <w:p>
+      <w:r>
+        <w:t xml:space="preserve">🧠 Zihinsel: Bir fikrini sorgula.</w:t>
+      </w:r>
+    </w:p>
+    <w:p>
+      <w:r>
+        <w:t xml:space="preserve">🧠 Zihinsel: Seni motive eden şeyi yaz.</w:t>
+      </w:r>
+    </w:p>
+    <w:p>
+      <w:r>
+        <w:t xml:space="preserve">🧠 Zihinsel: Bir kararını gözden geçir.</w:t>
+      </w:r>
+    </w:p>
+    <w:p>
+      <w:r>
+        <w:t xml:space="preserve">🧠 Zihinsel: Bir hedefe ilk adımı planla.</w:t>
+      </w:r>
+    </w:p>
+    <w:p>
+      <w:r>
         <w:t xml:space="preserve">🌙 Ruhsal: Şükrettiğin 3 şeyi yaz.</w:t>
       </w:r>
     </w:p>
@@ -600,6 +730,46 @@
     <w:p>
       <w:r>
         <w:t xml:space="preserve">🌙 Ruhsal: Kendini kutlayan bir teşekkür mesajı yaz.</w:t>
+      </w:r>
+    </w:p>
+    <w:p>
+      <w:r>
+        <w:t xml:space="preserve">🌙 Ruhsal: İçinden geçen ilk duyguyu yaz.</w:t>
+      </w:r>
+    </w:p>
+    <w:p>
+      <w:r>
+        <w:t xml:space="preserve">🌙 Ruhsal: Sevdiğin bir anıyı tekrar yaşa.</w:t>
+      </w:r>
+    </w:p>
+    <w:p>
+      <w:r>
+        <w:t xml:space="preserve">🌙 Ruhsal: Aynada gözlerinin içine bak.</w:t>
+      </w:r>
+    </w:p>
+    <w:p>
+      <w:r>
+        <w:t xml:space="preserve">🌙 Ruhsal: Kendine sarıl.</w:t>
+      </w:r>
+    </w:p>
+    <w:p>
+      <w:r>
+        <w:t xml:space="preserve">🌙 Ruhsal: Bir yükünü kağıda yaz.</w:t>
+      </w:r>
+    </w:p>
+    <w:p>
+      <w:r>
+        <w:t xml:space="preserve">🌙 Ruhsal: Bugün neye ihtiyacın olduğunu sor.</w:t>
+      </w:r>
+    </w:p>
+    <w:p>
+      <w:r>
+        <w:t xml:space="preserve">🌙 Ruhsal: Kalbinle konuş.</w:t>
+      </w:r>
+    </w:p>
+    <w:p>
+      <w:r>
+        <w:t xml:space="preserve">🌙 Ruhsal: Kendini affet.</w:t>
       </w:r>
     </w:p>
     <w:sectPr/>

</xml_diff>

<commit_message>
Gunun Gorevleri: 5. set eklendi, ayni/benzer ayiklandi (F54/R56/Z68)
Besinci set mevcut havuza eklendi. Yeni: bir ogunu bilincli ye, bagis kutusu, aynaya gulumse, masa hazirla, 15 dk hicbir sey yapma, gun dogumu, cicek satin al, gereksiz alisveris yapma; 5 yanlis inanc, cocukken olmak istedigin, tetikleyen olayi analiz, donum noktasi, en zor soru, tekrar eden dongu, dogru karar, yasam mottosu, dusunceleri gozlemle, birakman gereken sey; eski fotograf+sevgi, affetme mektubu, evrene tesekkur mektubu, icindeki isigi tarif, gelecekteki halinle sohbet, kalp merkezine odaklan. Toplam 178 gorev. v113.

Co-Authored-By: Claude Opus 4.8 <noreply@anthropic.com>
</commit_message>
<xml_diff>
--- a/Günün Görevleri/Günün Görevleri.docx
+++ b/Günün Görevleri/Günün Görevleri.docx
@@ -234,6 +234,46 @@
     </w:p>
     <w:p>
       <w:r>
+        <w:t xml:space="preserve">🌿 Fiziksel: Bir öğününü yavaş ve bilinçli ye.</w:t>
+      </w:r>
+    </w:p>
+    <w:p>
+      <w:r>
+        <w:t xml:space="preserve">🌿 Fiziksel: Kullanmadığın 3 eşyayı bağış kutusuna ayır.</w:t>
+      </w:r>
+    </w:p>
+    <w:p>
+      <w:r>
+        <w:t xml:space="preserve">🌿 Fiziksel: Gün içinde aynaya gülümse.</w:t>
+      </w:r>
+    </w:p>
+    <w:p>
+      <w:r>
+        <w:t xml:space="preserve">🌿 Fiziksel: Kendine güzel bir masa hazırla.</w:t>
+      </w:r>
+    </w:p>
+    <w:p>
+      <w:r>
+        <w:t xml:space="preserve">🌿 Fiziksel: Gün içinde 15 dakika hiçbir şey yapma.</w:t>
+      </w:r>
+    </w:p>
+    <w:p>
+      <w:r>
+        <w:t xml:space="preserve">🌿 Fiziksel: Gün doğumunu izle.</w:t>
+      </w:r>
+    </w:p>
+    <w:p>
+      <w:r>
+        <w:t xml:space="preserve">🌿 Fiziksel: Kendine küçük bir çiçek satın al.</w:t>
+      </w:r>
+    </w:p>
+    <w:p>
+      <w:r>
+        <w:t xml:space="preserve">🌿 Fiziksel: Bir gün boyunca gereksiz alışveriş yapma.</w:t>
+      </w:r>
+    </w:p>
+    <w:p>
+      <w:r>
         <w:t xml:space="preserve">🧠 Zihinsel: Yeni bir kelime öğren.</w:t>
       </w:r>
     </w:p>
@@ -524,6 +564,56 @@
     </w:p>
     <w:p>
       <w:r>
+        <w:t xml:space="preserve">🧠 Zihinsel: Kendine ait 5 yanlış inancı yaz.</w:t>
+      </w:r>
+    </w:p>
+    <w:p>
+      <w:r>
+        <w:t xml:space="preserve">🧠 Zihinsel: Çocukken olmak istediğin kişiyi yaz.</w:t>
+      </w:r>
+    </w:p>
+    <w:p>
+      <w:r>
+        <w:t xml:space="preserve">🧠 Zihinsel: Bugün seni tetikleyen bir olayı analiz et.</w:t>
+      </w:r>
+    </w:p>
+    <w:p>
+      <w:r>
+        <w:t xml:space="preserve">🧠 Zihinsel: Hayatındaki en büyük dönüm noktasını yaz.</w:t>
+      </w:r>
+    </w:p>
+    <w:p>
+      <w:r>
+        <w:t xml:space="preserve">🧠 Zihinsel: Kendine sorduğun en zor soruyu yaz.</w:t>
+      </w:r>
+    </w:p>
+    <w:p>
+      <w:r>
+        <w:t xml:space="preserve">🧠 Zihinsel: Hayatında tekrar eden bir döngüyü fark et.</w:t>
+      </w:r>
+    </w:p>
+    <w:p>
+      <w:r>
+        <w:t xml:space="preserve">🧠 Zihinsel: Geçmişte doğru verdiğin bir kararı yaz.</w:t>
+      </w:r>
+    </w:p>
+    <w:p>
+      <w:r>
+        <w:t xml:space="preserve">🧠 Zihinsel: Yeni bir yaşam mottosu belirle.</w:t>
+      </w:r>
+    </w:p>
+    <w:p>
+      <w:r>
+        <w:t xml:space="preserve">🧠 Zihinsel: Bugünkü düşüncelerini gözlemle.</w:t>
+      </w:r>
+    </w:p>
+    <w:p>
+      <w:r>
+        <w:t xml:space="preserve">🧠 Zihinsel: Hayatında bırakman gereken şeyi yaz.</w:t>
+      </w:r>
+    </w:p>
+    <w:p>
+      <w:r>
         <w:t xml:space="preserve">🌙 Ruhsal: Şükrettiğin 3 şeyi yaz.</w:t>
       </w:r>
     </w:p>
@@ -770,6 +860,36 @@
     <w:p>
       <w:r>
         <w:t xml:space="preserve">🌙 Ruhsal: Kendini affet.</w:t>
+      </w:r>
+    </w:p>
+    <w:p>
+      <w:r>
+        <w:t xml:space="preserve">🌙 Ruhsal: Eski bir fotoğrafına bakıp kendine sevgi gönder.</w:t>
+      </w:r>
+    </w:p>
+    <w:p>
+      <w:r>
+        <w:t xml:space="preserve">🌙 Ruhsal: Bir affetme mektubu yaz, göndermeden.</w:t>
+      </w:r>
+    </w:p>
+    <w:p>
+      <w:r>
+        <w:t xml:space="preserve">🌙 Ruhsal: Evrene teşekkür mektubu yaz.</w:t>
+      </w:r>
+    </w:p>
+    <w:p>
+      <w:r>
+        <w:t xml:space="preserve">🌙 Ruhsal: İçindeki ışığı tarif et.</w:t>
+      </w:r>
+    </w:p>
+    <w:p>
+      <w:r>
+        <w:t xml:space="preserve">🌙 Ruhsal: Gelecekteki halinle sohbet ettiğini hayal et.</w:t>
+      </w:r>
+    </w:p>
+    <w:p>
+      <w:r>
+        <w:t xml:space="preserve">🌙 Ruhsal: Kalbinin merkezine odaklan.</w:t>
       </w:r>
     </w:p>
     <w:sectPr/>

</xml_diff>

<commit_message>
Gunun Gorevleri: 6. set eklendi, ayni/benzer ayiklandi (F59/R63/Z78=200)
Altinci set mevcut havuza eklendi. Yeni: ihtiyacin kadar konus, 30 dk yalniz kal, obje yerini degistir, gozlerini dinlendir, sikayet etmeme; 3 bahane, kendini sinirladigin alan, korkunun arkasindaki ihtiyac, neyin fazla, 10 yil oncene tavsiye, hayran oldugun ozellik, bugun farkli ne yaptin, basarisizligin kazandirdigi, cogalmasini istedigin, astigin zorluklar; ilk sezgi, neyi birakmak istedigin, kendine guven, o ozellik sende de var, degisime niyet, bolluk hissi, biten dongu serbest. Toplam 200 gorev. v114.

Co-Authored-By: Claude Opus 4.8 <noreply@anthropic.com>
</commit_message>
<xml_diff>
--- a/Günün Görevleri/Günün Görevleri.docx
+++ b/Günün Görevleri/Günün Görevleri.docx
@@ -274,6 +274,31 @@
     </w:p>
     <w:p>
       <w:r>
+        <w:t xml:space="preserve">🌿 Fiziksel: Gün boyunca sadece ihtiyacın kadar konuş.</w:t>
+      </w:r>
+    </w:p>
+    <w:p>
+      <w:r>
+        <w:t xml:space="preserve">🌿 Fiziksel: Gün içinde 30 dakika yalnız kal.</w:t>
+      </w:r>
+    </w:p>
+    <w:p>
+      <w:r>
+        <w:t xml:space="preserve">🌿 Fiziksel: Evdeki bir objenin yerini değiştir.</w:t>
+      </w:r>
+    </w:p>
+    <w:p>
+      <w:r>
+        <w:t xml:space="preserve">🌿 Fiziksel: Gün içinde 5 dakika gözlerini dinlendir.</w:t>
+      </w:r>
+    </w:p>
+    <w:p>
+      <w:r>
+        <w:t xml:space="preserve">🌿 Fiziksel: Bir gün boyunca şikâyet etmemeye çalış.</w:t>
+      </w:r>
+    </w:p>
+    <w:p>
+      <w:r>
         <w:t xml:space="preserve">🧠 Zihinsel: Yeni bir kelime öğren.</w:t>
       </w:r>
     </w:p>
@@ -614,6 +639,56 @@
     </w:p>
     <w:p>
       <w:r>
+        <w:t xml:space="preserve">🧠 Zihinsel: En çok kullandığın 3 bahaneyi yaz.</w:t>
+      </w:r>
+    </w:p>
+    <w:p>
+      <w:r>
+        <w:t xml:space="preserve">🧠 Zihinsel: Kendini sınırladığın bir alanı fark et.</w:t>
+      </w:r>
+    </w:p>
+    <w:p>
+      <w:r>
+        <w:t xml:space="preserve">🧠 Zihinsel: Bir korkunun arkasındaki ihtiyacı bul.</w:t>
+      </w:r>
+    </w:p>
+    <w:p>
+      <w:r>
+        <w:t xml:space="preserve">🧠 Zihinsel: Hayatında neyin fazla olduğunu yaz.</w:t>
+      </w:r>
+    </w:p>
+    <w:p>
+      <w:r>
+        <w:t xml:space="preserve">🧠 Zihinsel: 10 yıl önceki haline tavsiye ver.</w:t>
+      </w:r>
+    </w:p>
+    <w:p>
+      <w:r>
+        <w:t xml:space="preserve">🧠 Zihinsel: Hayran olduğun bir kişinin özelliğini yaz.</w:t>
+      </w:r>
+    </w:p>
+    <w:p>
+      <w:r>
+        <w:t xml:space="preserve">🧠 Zihinsel: Bugün farklı ne yaptığını yaz.</w:t>
+      </w:r>
+    </w:p>
+    <w:p>
+      <w:r>
+        <w:t xml:space="preserve">🧠 Zihinsel: Başarısızlık sandığın bir olayın sana kazandırdığını yaz.</w:t>
+      </w:r>
+    </w:p>
+    <w:p>
+      <w:r>
+        <w:t xml:space="preserve">🧠 Zihinsel: Hayatında çoğalmasını istediğin şeyi yaz.</w:t>
+      </w:r>
+    </w:p>
+    <w:p>
+      <w:r>
+        <w:t xml:space="preserve">🧠 Zihinsel: Bugüne kadar aştığın zorlukları listele.</w:t>
+      </w:r>
+    </w:p>
+    <w:p>
+      <w:r>
         <w:t xml:space="preserve">🌙 Ruhsal: Şükrettiğin 3 şeyi yaz.</w:t>
       </w:r>
     </w:p>
@@ -890,6 +965,41 @@
     <w:p>
       <w:r>
         <w:t xml:space="preserve">🌙 Ruhsal: Kalbinin merkezine odaklan.</w:t>
+      </w:r>
+    </w:p>
+    <w:p>
+      <w:r>
+        <w:t xml:space="preserve">🌙 Ruhsal: İçinden geçen ilk sezgiyi not et.</w:t>
+      </w:r>
+    </w:p>
+    <w:p>
+      <w:r>
+        <w:t xml:space="preserve">🌙 Ruhsal: Bugün neyi bırakmak istediğini yaz.</w:t>
+      </w:r>
+    </w:p>
+    <w:p>
+      <w:r>
+        <w:t xml:space="preserve">🌙 Ruhsal: Kendine, sana güvendiğini söyle.</w:t>
+      </w:r>
+    </w:p>
+    <w:p>
+      <w:r>
+        <w:t xml:space="preserve">🌙 Ruhsal: O özelliğin sende de olduğunu kabul et.</w:t>
+      </w:r>
+    </w:p>
+    <w:p>
+      <w:r>
+        <w:t xml:space="preserve">🌙 Ruhsal: Değişime açık olduğuna dair niyet kur.</w:t>
+      </w:r>
+    </w:p>
+    <w:p>
+      <w:r>
+        <w:t xml:space="preserve">🌙 Ruhsal: Bolluk hissini hayal et.</w:t>
+      </w:r>
+    </w:p>
+    <w:p>
+      <w:r>
+        <w:t xml:space="preserve">🌙 Ruhsal: Biten bir döngüyü serbest bırak.</w:t>
       </w:r>
     </w:p>
     <w:sectPr/>

</xml_diff>